<commit_message>
Add headshot to the top left of the resume and CV
Co-Authored-By: Claude Opus 5.5 <noreply@anthropic.com>
</commit_message>
<xml_diff>
--- a/resume/files/vishal-rai-CV.docx
+++ b/resume/files/vishal-rai-CV.docx
@@ -4,6 +4,54 @@
   <w:body>
     <w:p>
       <w:r>
+        <w:drawing>
+          <wp:anchor distT="0" distB="0" distL="0" distR="114300" simplePos="0" allowOverlap="1" behindDoc="0" locked="0" layoutInCell="1" relativeHeight="762000">
+            <wp:simplePos x="0" y="0"/>
+            <wp:positionH relativeFrom="margin">
+              <wp:posOffset>0</wp:posOffset>
+            </wp:positionH>
+            <wp:positionV relativeFrom="paragraph">
+              <wp:posOffset>0</wp:posOffset>
+            </wp:positionV>
+            <wp:extent cx="762000" cy="762000"/>
+            <wp:effectExtent t="0" r="0" b="0" l="0"/>
+            <wp:wrapSquare wrapText="right" distR="114300"/>
+            <wp:docPr id="2" name=""/>
+            <wp:cNvGraphicFramePr>
+              <a:graphicFrameLocks xmlns:a="http://schemas.openxmlformats.org/drawingml/2006/main" noChangeAspect="1"/>
+            </wp:cNvGraphicFramePr>
+            <a:graphic xmlns:a="http://schemas.openxmlformats.org/drawingml/2006/main">
+              <a:graphicData uri="http://schemas.openxmlformats.org/drawingml/2006/picture">
+                <pic:pic xmlns:pic="http://schemas.openxmlformats.org/drawingml/2006/picture">
+                  <pic:nvPicPr>
+                    <pic:cNvPr id="0" name="" descr=""/>
+                    <pic:cNvPicPr>
+                      <a:picLocks noChangeAspect="1" noChangeArrowheads="1"/>
+                    </pic:cNvPicPr>
+                  </pic:nvPicPr>
+                  <pic:blipFill>
+                    <a:blip r:embed="rId7" cstate="none"/>
+                    <a:srcRect/>
+                    <a:stretch>
+                      <a:fillRect/>
+                    </a:stretch>
+                  </pic:blipFill>
+                  <pic:spPr bwMode="auto">
+                    <a:xfrm>
+                      <a:off x="0" y="0"/>
+                      <a:ext cx="762000" cy="762000"/>
+                    </a:xfrm>
+                    <a:prstGeom prst="rect">
+                      <a:avLst/>
+                    </a:prstGeom>
+                  </pic:spPr>
+                </pic:pic>
+              </a:graphicData>
+            </a:graphic>
+          </wp:anchor>
+        </w:drawing>
+      </w:r>
+      <w:r>
         <w:rPr>
           <w:rFonts w:ascii="Calibri" w:cs="Calibri" w:eastAsia="Calibri" w:hAnsi="Calibri"/>
           <w:b/>
@@ -30,6 +78,19 @@
     </w:p>
     <w:p>
       <w:pPr>
+        <w:spacing w:after="0"/>
+      </w:pPr>
+      <w:r>
+        <w:rPr>
+          <w:rFonts w:ascii="Calibri" w:cs="Calibri" w:eastAsia="Calibri" w:hAnsi="Calibri"/>
+          <w:sz w:val="21"/>
+          <w:szCs w:val="21"/>
+        </w:rPr>
+        <w:t xml:space="preserve">Kolkata, India | +91 8240485685 | rai.vishal0801@gmail.com</w:t>
+      </w:r>
+    </w:p>
+    <w:p>
+      <w:pPr>
         <w:spacing w:after="60"/>
       </w:pPr>
       <w:r>
@@ -38,7 +99,7 @@
           <w:sz w:val="21"/>
           <w:szCs w:val="21"/>
         </w:rPr>
-        <w:t xml:space="preserve">Kolkata, India | +91 8240485685 | rai.vishal0801@gmail.com | linkedin.com/in/vishal-rai-b0316422a | github.com/vishalrai123</w:t>
+        <w:t xml:space="preserve">linkedin.com/in/vishal-rai-b0316422a | github.com/vishalrai123</w:t>
       </w:r>
     </w:p>
     <w:p>

</xml_diff>